<commit_message>
docs: 14 documentos novos (CI/CD, dívida técnica, feature flags, suporte, acessos, privacidade pública e outros)
</commit_message>
<xml_diff>
--- a/04-desenvolvimento/01-preparacao-do-ambiente.docx
+++ b/04-desenvolvimento/01-preparacao-do-ambiente.docx
@@ -2079,7 +2079,7 @@
       </w:r>
     </w:p>
     <w:bookmarkEnd w:id="55"/>
-    <w:bookmarkStart w:id="56" w:name="dados-de-teste"/>
+    <w:bookmarkStart w:id="57" w:name="dados-de-teste"/>
     <w:p>
       <w:pPr>
         <w:pStyle w:val="Heading2"/>
@@ -2266,6 +2266,41 @@
         <w:pStyle w:val="BodyText"/>
       </w:pPr>
       <w:r>
+        <w:t xml:space="preserve">Estes dados são</w:t>
+      </w:r>
+      <w:r>
+        <w:t xml:space="preserve"> </w:t>
+      </w:r>
+      <w:r>
+        <w:rPr>
+          <w:b/>
+          <w:bCs/>
+        </w:rPr>
+        <w:t xml:space="preserve">gerados</w:t>
+      </w:r>
+      <w:r>
+        <w:t xml:space="preserve">, nunca copiados de produção — ver</w:t>
+      </w:r>
+      <w:r>
+        <w:t xml:space="preserve"> </w:t>
+      </w:r>
+      <w:hyperlink r:id="rId56">
+        <w:r>
+          <w:rPr>
+            <w:rStyle w:val="Hyperlink"/>
+          </w:rPr>
+          <w:t xml:space="preserve">Dados de Teste e Anonimização</w:t>
+        </w:r>
+      </w:hyperlink>
+      <w:r>
+        <w:t xml:space="preserve">.</w:t>
+      </w:r>
+    </w:p>
+    <w:p>
+      <w:pPr>
+        <w:pStyle w:val="BodyText"/>
+      </w:pPr>
+      <w:r>
         <w:rPr>
           <w:rStyle w:val="VerbatimChar"/>
         </w:rPr>
@@ -2285,8 +2320,8 @@
         </w:pict>
       </w:r>
     </w:p>
-    <w:bookmarkEnd w:id="56"/>
-    <w:bookmarkStart w:id="57" w:name="resolução-de-problemas"/>
+    <w:bookmarkEnd w:id="57"/>
+    <w:bookmarkStart w:id="58" w:name="resolução-de-problemas"/>
     <w:p>
       <w:pPr>
         <w:pStyle w:val="Heading2"/>
@@ -2607,8 +2642,8 @@
         </w:pict>
       </w:r>
     </w:p>
-    <w:bookmarkEnd w:id="57"/>
-    <w:bookmarkStart w:id="58" w:name="estrutura-do-repositório"/>
+    <w:bookmarkEnd w:id="58"/>
+    <w:bookmarkStart w:id="59" w:name="estrutura-do-repositório"/>
     <w:p>
       <w:pPr>
         <w:pStyle w:val="Heading2"/>
@@ -2736,7 +2771,7 @@
         <w:t xml:space="preserve">└── Makefile</w:t>
       </w:r>
     </w:p>
-    <w:bookmarkEnd w:id="58"/>
+    <w:bookmarkEnd w:id="59"/>
     <w:sectPr>
       <w:footerReference xmlns:r="http://schemas.openxmlformats.org/officeDocument/2006/relationships" r:id="rId40" w:type="default"/>
       <w:pgSz w:h="16838" w:w="11906"/>

</xml_diff>